<commit_message>
afcca answering-brief, opening-brief: shared cross-engine layout model (lib/*/xengine*), docx breaks every line and page as typst; params.cross_engine: gate
typst: Times New Roman 12 pt in 24.6 pt body (the former 0.94 em leading) and 14.7 pt single line boxes, explicit
block spaces, listing-row TOC and TOA, footnote clearance as LibreOffice's footnote area. docx: afcca.lua on
docx.xengine at the typst pitches, caption as a fixed table, TOC and TOA page numbers from the multi-pass engine
(render.sh retired), TOA passim at 7 pages and each page once as typst, word joiner in ')(' tokens; reference.docx
from make-reference.sh (lib/docx/xengine-reference.sh) replaces reference.xml and build-reference.sh; level-4
labels upright as typst. INPUT-opening-brief.md: a straight closing quote corrected. XENG-001..003 PASS on all four
samples; check.sh typst 16/0, docx 24/0 on each folder (fb-595.54.7)
</commit_message>
<xml_diff>
--- a/courts/military/air-force-court-of-criminal-appeals/answering-brief/docx/reference.docx
+++ b/courts/military/air-force-court-of-criminal-appeals/answering-brief/docx/reference.docx
@@ -314,10 +314,9 @@
       </w:r>
     </w:p>
     <w:sectPr>
-      <w:footerReference w:type="default" r:id="rIdAfccaFooter"/>
+      <w:footerReference w:type="default" r:id="rIdFooter1"/>
       <w:pgSz w:w="12240" w:h="15840"/>
-      <w:pgMar w:top="1440" w:right="1440" w:bottom="1440" w:left="1440" w:header="720" w:footer="720" w:gutter="0"/>
-      <w:pgNumType w:fmt="decimal" w:start="1"/>
+      <w:pgMar w:top="1440" w:right="1440" w:bottom="1440" w:left="1440" w:header="720" w:footer="432" w:gutter="0"/>
     </w:sectPr>
   </w:body>
 </w:document>
@@ -332,8 +331,6 @@
   <w:p>
     <w:pPr>
       <w:jc w:val="center"/>
-      <w:spacing w:after="0" w:line="240" w:lineRule="auto"/>
-      <w:ind w:firstLine="0"/>
     </w:pPr>
     <w:r>
       <w:fldChar w:fldCharType="begin"/>
@@ -513,20 +510,48 @@
   <w:docDefaults>
     <w:rPrDefault>
       <w:rPr>
-        <w:rFonts w:ascii="EB Garamond" w:hAnsi="EB Garamond" w:eastAsia="EB Garamond" w:cs="EB Garamond"/>
+        <w:rFonts w:ascii="Times New Roman" w:hAnsi="Times New Roman" w:eastAsia="Times New Roman" w:cs="Times New Roman"/>
         <w:sz w:val="24"/>
         <w:szCs w:val="24"/>
-        <w:lang w:val="en-US" w:eastAsia="en-US" w:bidi="ar-SA"/>
+        <w:lang w:val="en-US" w:eastAsia="zh-CN" w:bidi="ar-SA"/>
       </w:rPr>
     </w:rPrDefault>
     <w:pPrDefault>
       <w:pPr>
         <w:widowControl/>
-        <w:spacing w:after="0" w:line="240" w:lineRule="auto"/>
+        <w:spacing w:after="0"/>
       </w:pPr>
     </w:pPrDefault>
   </w:docDefaults>
   <w:latentStyles w:defLockedState="0" w:defUIPriority="0" w:defSemiHidden="0" w:defUnhideWhenUsed="0" w:defQFormat="0" w:count="276"/>
+  <w:style w:type="paragraph" w:default="1" w:styleId="Normal">
+    <w:name w:val="Normal"/>
+    <w:qFormat/>
+  </w:style>
+  <w:style w:type="paragraph" w:styleId="BodyText">
+    <w:name w:val="Body Text"/>
+    <w:basedOn w:val="Normal"/>
+    <w:link w:val="BodyTextChar"/>
+    <w:qFormat/>
+    <w:pPr>
+      <w:spacing w:before="0" w:after="0" w:line="492" w:lineRule="exact"/>
+      <w:ind w:firstLine="720"/>
+    </w:pPr>
+  </w:style>
+  <w:style w:type="paragraph" w:customStyle="1" w:styleId="FirstParagraph">
+    <w:name w:val="First Paragraph"/>
+    <w:basedOn w:val="BodyText"/>
+    <w:next w:val="BodyText"/>
+    <w:qFormat/>
+  </w:style>
+  <w:style w:type="paragraph" w:customStyle="1" w:styleId="Compact">
+    <w:name w:val="Compact"/>
+    <w:basedOn w:val="BodyText"/>
+    <w:qFormat/>
+    <w:pPr>
+      <w:spacing w:before="36" w:after="36"/>
+    </w:pPr>
+  </w:style>
   <w:style w:type="paragraph" w:styleId="Title">
     <w:name w:val="Title"/>
     <w:basedOn w:val="Normal"/>
@@ -660,6 +685,138 @@
     <w:pPr/>
     <w:rPr/>
   </w:style>
+  <w:style w:type="paragraph" w:styleId="Heading1">
+    <w:name w:val="heading 1"/>
+    <w:basedOn w:val="Normal"/>
+    <w:next w:val="BodyText"/>
+    <w:link w:val="Heading1Char"/>
+    <w:uiPriority w:val="9"/>
+    <w:qFormat/>
+    <w:rsid w:val="00A10FD9"/>
+    <w:pPr>
+      <w:keepNext/>
+      <w:keepLines/>
+      <w:spacing w:before="240" w:after="120" w:line="294" w:lineRule="exact"/>
+      <w:ind w:firstLine="0"/>
+      <w:jc w:val="center"/>
+      <w:outlineLvl w:val="0"/>
+    </w:pPr>
+    <w:rPr>
+      <w:rFonts w:ascii="Times New Roman" w:hAnsi="Times New Roman" w:eastAsia="Times New Roman" w:cs="Times New Roman"/>
+      <w:b/>
+      <w:bCs/>
+      <w:caps/>
+      <w:color w:val="000000"/>
+      <w:sz w:val="24"/>
+      <w:szCs w:val="24"/>
+    </w:rPr>
+  </w:style>
+  <w:style w:type="paragraph" w:styleId="Heading2">
+    <w:name w:val="heading 2"/>
+    <w:basedOn w:val="Normal"/>
+    <w:next w:val="BodyText"/>
+    <w:link w:val="Heading2Char"/>
+    <w:uiPriority w:val="9"/>
+    <w:semiHidden/>
+    <w:unhideWhenUsed/>
+    <w:qFormat/>
+    <w:rsid w:val="00A10FD9"/>
+    <w:pPr>
+      <w:keepNext/>
+      <w:keepLines/>
+      <w:spacing w:before="240" w:after="120" w:line="294" w:lineRule="exact"/>
+      <w:ind w:firstLine="0"/>
+      <w:outlineLvl w:val="1"/>
+    </w:pPr>
+    <w:rPr>
+      <w:rFonts w:ascii="Times New Roman" w:hAnsi="Times New Roman" w:eastAsia="Times New Roman" w:cs="Times New Roman"/>
+      <w:b/>
+      <w:bCs/>
+      <w:color w:val="000000"/>
+      <w:sz w:val="24"/>
+      <w:szCs w:val="24"/>
+    </w:rPr>
+  </w:style>
+  <w:style w:type="paragraph" w:styleId="Heading3">
+    <w:name w:val="heading 3"/>
+    <w:basedOn w:val="Normal"/>
+    <w:next w:val="BodyText"/>
+    <w:link w:val="Heading3Char"/>
+    <w:uiPriority w:val="9"/>
+    <w:semiHidden/>
+    <w:unhideWhenUsed/>
+    <w:qFormat/>
+    <w:rsid w:val="00A10FD9"/>
+    <w:pPr>
+      <w:keepNext/>
+      <w:keepLines/>
+      <w:spacing w:before="240" w:after="120" w:line="294" w:lineRule="exact"/>
+      <w:ind w:firstLine="0"/>
+      <w:outlineLvl w:val="2"/>
+    </w:pPr>
+    <w:rPr>
+      <w:rFonts w:ascii="Times New Roman" w:hAnsi="Times New Roman" w:eastAsia="Times New Roman" w:cs="Times New Roman"/>
+      <w:b/>
+      <w:bCs/>
+      <w:color w:val="000000"/>
+      <w:sz w:val="24"/>
+      <w:szCs w:val="24"/>
+    </w:rPr>
+  </w:style>
+  <w:style w:type="paragraph" w:styleId="Heading4">
+    <w:name w:val="heading 4"/>
+    <w:basedOn w:val="Normal"/>
+    <w:next w:val="BodyText"/>
+    <w:link w:val="Heading4Char"/>
+    <w:uiPriority w:val="9"/>
+    <w:semiHidden/>
+    <w:unhideWhenUsed/>
+    <w:qFormat/>
+    <w:rsid w:val="00A10FD9"/>
+    <w:pPr>
+      <w:keepNext/>
+      <w:keepLines/>
+      <w:spacing w:before="240" w:after="120" w:line="294" w:lineRule="exact"/>
+      <w:ind w:firstLine="0"/>
+      <w:outlineLvl w:val="3"/>
+    </w:pPr>
+    <w:rPr>
+      <w:rFonts w:ascii="Times New Roman" w:hAnsi="Times New Roman" w:eastAsia="Times New Roman" w:cs="Times New Roman"/>
+      <w:b/>
+      <w:bCs/>
+      <w:i/>
+      <w:color w:val="000000"/>
+      <w:sz w:val="24"/>
+      <w:szCs w:val="24"/>
+    </w:rPr>
+  </w:style>
+  <w:style w:type="paragraph" w:styleId="Heading5">
+    <w:name w:val="heading 5"/>
+    <w:basedOn w:val="Normal"/>
+    <w:next w:val="BodyText"/>
+    <w:link w:val="Heading5Char"/>
+    <w:uiPriority w:val="9"/>
+    <w:semiHidden/>
+    <w:unhideWhenUsed/>
+    <w:qFormat/>
+    <w:rsid w:val="00A10FD9"/>
+    <w:pPr>
+      <w:keepNext/>
+      <w:keepLines/>
+      <w:spacing w:before="240" w:after="120" w:line="294" w:lineRule="exact"/>
+      <w:ind w:firstLine="0"/>
+      <w:outlineLvl w:val="4"/>
+    </w:pPr>
+    <w:rPr>
+      <w:rFonts w:ascii="Times New Roman" w:hAnsi="Times New Roman" w:eastAsia="Times New Roman" w:cs="Times New Roman"/>
+      <w:b/>
+      <w:bCs/>
+      <w:i/>
+      <w:color w:val="000000"/>
+      <w:sz w:val="24"/>
+      <w:szCs w:val="24"/>
+    </w:rPr>
+  </w:style>
   <w:style w:type="paragraph" w:styleId="Heading6">
     <w:name w:val="heading 6"/>
     <w:basedOn w:val="Normal"/>
@@ -867,6 +1024,43 @@
       <w:color w:val="272727" w:themeColor="text1" w:themeTint="D8"/>
     </w:rPr>
   </w:style>
+  <w:style w:type="paragraph" w:customStyle="1" w:styleId="ListItem">
+    <w:name w:val="List Item"/>
+    <w:basedOn w:val="BodyText"/>
+    <w:qFormat/>
+    <w:pPr>
+      <w:spacing w:before="0" w:after="0" w:line="492" w:lineRule="exact"/>
+      <w:ind w:left="720" w:hanging="720"/>
+    </w:pPr>
+  </w:style>
+  <w:style w:type="paragraph" w:styleId="BlockText">
+    <w:name w:val="Block Text"/>
+    <w:basedOn w:val="BodyText"/>
+    <w:next w:val="BodyText"/>
+    <w:uiPriority w:val="9"/>
+    <w:unhideWhenUsed/>
+    <w:qFormat/>
+    <w:pPr>
+      <w:spacing w:before="240" w:after="240" w:line="294" w:lineRule="exact"/>
+      <w:ind w:firstLine="0" w:left="720" w:right="720"/>
+    </w:pPr>
+  </w:style>
+  <w:style w:type="paragraph" w:styleId="FootnoteText">
+    <w:name w:val="Footnote Text"/>
+    <w:basedOn w:val="Normal"/>
+    <w:next w:val="FootnoteText"/>
+    <w:uiPriority w:val="9"/>
+    <w:unhideWhenUsed/>
+    <w:qFormat/>
+    <w:pPr>
+      <w:keepLines/>
+      <w:spacing w:before="0" w:after="120" w:line="294" w:lineRule="exact"/>
+    </w:pPr>
+    <w:rPr>
+      <w:sz w:val="24"/>
+      <w:szCs w:val="24"/>
+    </w:rPr>
+  </w:style>
   <w:style w:type="paragraph" w:styleId="FootnoteBlockText">
     <w:name w:val="Footnote Block Text"/>
     <w:basedOn w:val="FootnoteText"/>
@@ -875,14 +1069,36 @@
     <w:unhideWhenUsed/>
     <w:qFormat/>
     <w:pPr>
-      <w:spacing w:before="100" w:after="100"/>
-      <w:ind w:firstLine="0" w:left="480" w:right="480"/>
+      <w:spacing w:before="240" w:after="240"/>
+      <w:ind w:firstLine="0" w:left="720" w:right="720"/>
     </w:pPr>
   </w:style>
   <w:style w:type="character" w:default="1" w:styleId="DefaultParagraphFont">
     <w:name w:val="Default Paragraph Font"/>
     <w:semiHidden/>
     <w:unhideWhenUsed/>
+  </w:style>
+  <w:style w:type="table" w:default="1" w:styleId="Table">
+    <w:name w:val="Table"/>
+    <w:basedOn w:val="TableNormal"/>
+    <w:qFormat/>
+    <w:tblPr>
+      <w:tblInd w:w="0" w:type="dxa"/>
+      <w:tblCellMar>
+        <w:top w:w="0" w:type="dxa"/>
+        <w:left w:w="108" w:type="dxa"/>
+        <w:bottom w:w="0" w:type="dxa"/>
+        <w:right w:w="108" w:type="dxa"/>
+      </w:tblCellMar>
+    </w:tblPr>
+    <w:tblStylePr w:type="firstRow">
+      <w:tcPr>
+        <w:tcBorders>
+          <w:bottom w:val="single"/>
+        </w:tcBorders>
+        <w:vAlign w:val="bottom"/>
+      </w:tcPr>
+    </w:tblStylePr>
   </w:style>
   <w:style w:type="paragraph" w:customStyle="1" w:styleId="DefinitionTerm">
     <w:name w:val="Definition Term"/>
@@ -962,7 +1178,7 @@
     <w:name w:val="Hyperlink"/>
     <w:basedOn w:val="BodyTextChar"/>
     <w:rPr>
-      <w:color w:val="4F81BD" w:themeColor="accent1"/>
+      <w:color w:val="000000"/>
     </w:rPr>
   </w:style>
   <w:style w:type="paragraph" w:styleId="TOCHeading">
@@ -982,531 +1198,6 @@
       <w:bCs w:val="0"/>
       <w:color w:val="365F91" w:themeColor="accent1" w:themeShade="BF"/>
     </w:rPr>
-  </w:style>
-  <w:style w:type="table" w:styleId="Table">
-    <w:name w:val="Table"/>
-    <w:uiPriority w:val="59"/>
-    <w:pPr>
-      <w:spacing w:after="0" w:line="240" w:lineRule="auto"/>
-    </w:pPr>
-    <w:tblPr>
-      <w:tblBorders>
-        <w:top w:val="nil"/>
-        <w:left w:val="nil"/>
-        <w:bottom w:val="nil"/>
-        <w:right w:val="nil"/>
-        <w:insideH w:val="nil"/>
-        <w:insideV w:val="nil"/>
-      </w:tblBorders>
-      <w:tblCellMar>
-        <w:left w:w="0" w:type="dxa"/>
-        <w:right w:w="0" w:type="dxa"/>
-      </w:tblCellMar>
-    </w:tblPr>
-  </w:style>
-  <w:style w:type="paragraph" w:default="1" w:styleId="Normal">
-    <w:name w:val="Normal"/>
-    <w:qFormat/>
-    <w:pPr>
-      <w:spacing w:before="0" w:after="0" w:line="240" w:lineRule="auto"/>
-      <w:jc w:val="left"/>
-    </w:pPr>
-    <w:rPr>
-      <w:rFonts w:ascii="EB Garamond" w:hAnsi="EB Garamond" w:eastAsia="EB Garamond" w:cs="EB Garamond"/>
-      <w:sz w:val="24"/>
-      <w:szCs w:val="24"/>
-    </w:rPr>
-  </w:style>
-  <w:style w:type="paragraph" w:styleId="BodyText">
-    <w:name w:val="Body Text"/>
-    <w:basedOn w:val="Normal"/>
-    <w:qFormat/>
-    <w:pPr>
-      <w:spacing w:before="0" w:after="0" w:line="540" w:lineRule="exact"/>
-      <w:ind w:firstLine="720"/>
-      <w:jc w:val="left"/>
-    </w:pPr>
-    <w:rPr/>
-  </w:style>
-  <w:style w:type="paragraph" w:styleId="FirstParagraph">
-    <w:name w:val="First Paragraph"/>
-    <w:basedOn w:val="Normal"/>
-    <w:qFormat/>
-    <w:pPr>
-      <w:spacing w:before="0" w:after="0" w:line="540" w:lineRule="exact"/>
-      <w:ind w:firstLine="720"/>
-      <w:jc w:val="left"/>
-    </w:pPr>
-    <w:rPr/>
-  </w:style>
-  <w:style w:type="paragraph" w:styleId="Compact">
-    <w:name w:val="Compact"/>
-    <w:basedOn w:val="Normal"/>
-    <w:qFormat/>
-    <w:pPr>
-      <w:spacing w:before="0" w:after="0" w:line="540" w:lineRule="exact"/>
-      <w:ind w:firstLine="720"/>
-    </w:pPr>
-    <w:rPr/>
-  </w:style>
-  <w:style w:type="paragraph" w:styleId="BlockText">
-    <w:name w:val="Block Text"/>
-    <w:basedOn w:val="Normal"/>
-    <w:qFormat/>
-    <w:pPr>
-      <w:spacing w:before="240" w:after="240" w:line="342" w:lineRule="exact"/>
-      <w:ind w:left="720" w:right="720" w:firstLine="0"/>
-      <w:jc w:val="left"/>
-    </w:pPr>
-    <w:rPr/>
-  </w:style>
-  <w:style w:type="paragraph" w:styleId="FootnoteText">
-    <w:name w:val="Footnote Text"/>
-    <w:basedOn w:val="Normal"/>
-    <w:qFormat/>
-    <w:pPr>
-      <w:spacing w:before="0" w:after="120" w:line="342" w:lineRule="exact"/>
-      <w:ind w:firstLine="0"/>
-    </w:pPr>
-    <w:rPr>
-      <w:sz w:val="24"/>
-      <w:szCs w:val="24"/>
-    </w:rPr>
-  </w:style>
-  <w:style w:type="paragraph" w:customStyle="1" w:styleId="Centered">
-    <w:name w:val="Centered"/>
-    <w:basedOn w:val="Normal"/>
-    <w:qFormat/>
-    <w:pPr>
-      <w:spacing w:before="0" w:after="0" w:line="342" w:lineRule="exact"/>
-      <w:ind w:firstLine="0"/>
-      <w:jc w:val="center"/>
-    </w:pPr>
-    <w:rPr/>
-  </w:style>
-  <w:style w:type="paragraph" w:customStyle="1" w:styleId="SectionHeading">
-    <w:name w:val="Section Heading"/>
-    <w:basedOn w:val="Normal"/>
-    <w:qFormat/>
-    <w:pPr>
-      <w:keepNext/>
-      <w:keepLines/>
-      <w:spacing w:before="336" w:after="240" w:line="342" w:lineRule="exact"/>
-      <w:ind w:firstLine="0"/>
-      <w:jc w:val="center"/>
-      <w:outlineLvl w:val="0"/>
-    </w:pPr>
-    <w:rPr>
-      <w:b/>
-      <w:bCs/>
-    </w:rPr>
-  </w:style>
-  <w:style w:type="paragraph" w:customStyle="1" w:styleId="SectionHeadingBreak">
-    <w:name w:val="Section Heading Break"/>
-    <w:basedOn w:val="Normal"/>
-    <w:qFormat/>
-    <w:pPr>
-      <w:keepNext/>
-      <w:keepLines/>
-      <w:pageBreakBefore/>
-      <w:spacing w:before="0" w:after="240" w:line="342" w:lineRule="exact"/>
-      <w:ind w:firstLine="0"/>
-      <w:jc w:val="center"/>
-      <w:outlineLvl w:val="0"/>
-    </w:pPr>
-    <w:rPr>
-      <w:b/>
-      <w:bCs/>
-    </w:rPr>
-  </w:style>
-  <w:style w:type="paragraph" w:customStyle="1" w:styleId="PointHeading">
-    <w:name w:val="Point Heading"/>
-    <w:basedOn w:val="Normal"/>
-    <w:qFormat/>
-    <w:pPr>
-      <w:keepNext/>
-      <w:keepLines/>
-      <w:spacing w:before="288" w:after="240" w:line="342" w:lineRule="exact"/>
-      <w:ind w:firstLine="0"/>
-      <w:jc w:val="center"/>
-      <w:outlineLvl w:val="1"/>
-    </w:pPr>
-    <w:rPr>
-      <w:b/>
-      <w:bCs/>
-    </w:rPr>
-  </w:style>
-  <w:style w:type="paragraph" w:customStyle="1" w:styleId="PointHeadingChained">
-    <w:name w:val="Point Heading Chained"/>
-    <w:basedOn w:val="Normal"/>
-    <w:qFormat/>
-    <w:pPr>
-      <w:keepLines/>
-      <w:spacing w:before="288" w:after="240" w:line="342" w:lineRule="exact"/>
-      <w:ind w:firstLine="0"/>
-      <w:jc w:val="center"/>
-      <w:outlineLvl w:val="1"/>
-    </w:pPr>
-    <w:rPr>
-      <w:b/>
-      <w:bCs/>
-    </w:rPr>
-  </w:style>
-  <w:style w:type="paragraph" w:customStyle="1" w:styleId="UnnumberedHeadingCentered">
-    <w:name w:val="Unnumbered Heading Centered"/>
-    <w:basedOn w:val="Normal"/>
-    <w:qFormat/>
-    <w:pPr>
-      <w:keepNext/>
-      <w:keepLines/>
-      <w:spacing w:before="264" w:after="216" w:line="342" w:lineRule="exact"/>
-      <w:ind w:firstLine="0"/>
-      <w:jc w:val="center"/>
-      <w:outlineLvl w:val="1"/>
-    </w:pPr>
-    <w:rPr>
-      <w:b/>
-      <w:bCs/>
-    </w:rPr>
-  </w:style>
-  <w:style w:type="paragraph" w:customStyle="1" w:styleId="UnnumberedHeadingLeft">
-    <w:name w:val="Unnumbered Heading Left"/>
-    <w:basedOn w:val="Normal"/>
-    <w:qFormat/>
-    <w:pPr>
-      <w:keepNext/>
-      <w:keepLines/>
-      <w:spacing w:before="264" w:after="216" w:line="342" w:lineRule="exact"/>
-      <w:ind w:firstLine="0"/>
-      <w:jc w:val="left"/>
-      <w:outlineLvl w:val="2"/>
-    </w:pPr>
-    <w:rPr>
-      <w:b/>
-      <w:bCs/>
-    </w:rPr>
-  </w:style>
-  <w:style w:type="paragraph" w:customStyle="1" w:styleId="SubHeading3">
-    <w:name w:val="Sub Heading 3"/>
-    <w:basedOn w:val="Normal"/>
-    <w:qFormat/>
-    <w:pPr>
-      <w:keepNext/>
-      <w:keepLines/>
-      <w:spacing w:before="264" w:after="216" w:line="342" w:lineRule="exact"/>
-      <w:ind w:left="1440" w:hanging="720"/>
-      <w:jc w:val="left"/>
-      <w:outlineLvl w:val="2"/>
-    </w:pPr>
-    <w:rPr>
-      <w:b/>
-      <w:bCs/>
-    </w:rPr>
-  </w:style>
-  <w:style w:type="paragraph" w:customStyle="1" w:styleId="SubHeading4">
-    <w:name w:val="Sub Heading 4"/>
-    <w:basedOn w:val="Normal"/>
-    <w:qFormat/>
-    <w:pPr>
-      <w:keepNext/>
-      <w:keepLines/>
-      <w:spacing w:before="264" w:after="216" w:line="342" w:lineRule="exact"/>
-      <w:ind w:left="2160" w:hanging="720"/>
-      <w:jc w:val="left"/>
-      <w:outlineLvl w:val="3"/>
-    </w:pPr>
-    <w:rPr>
-      <w:b/>
-      <w:bCs/>
-    </w:rPr>
-  </w:style>
-  <w:style w:type="paragraph" w:customStyle="1" w:styleId="SubHeading5">
-    <w:name w:val="Sub Heading 5"/>
-    <w:basedOn w:val="Normal"/>
-    <w:qFormat/>
-    <w:pPr>
-      <w:keepNext/>
-      <w:keepLines/>
-      <w:spacing w:before="264" w:after="216" w:line="342" w:lineRule="exact"/>
-      <w:ind w:left="2880" w:hanging="720"/>
-      <w:jc w:val="left"/>
-      <w:outlineLvl w:val="4"/>
-    </w:pPr>
-    <w:rPr>
-      <w:b/>
-      <w:bCs/>
-    </w:rPr>
-  </w:style>
-  <w:style w:type="paragraph" w:customStyle="1" w:styleId="CaptionLine">
-    <w:name w:val="Caption Line"/>
-    <w:basedOn w:val="Normal"/>
-    <w:qFormat/>
-    <w:pPr>
-      <w:spacing w:before="0" w:after="72" w:line="342" w:lineRule="exact"/>
-      <w:ind w:firstLine="0"/>
-      <w:jc w:val="left"/>
-    </w:pPr>
-    <w:rPr/>
-  </w:style>
-  <w:style w:type="paragraph" w:customStyle="1" w:styleId="CaptionVersus">
-    <w:name w:val="Caption Versus"/>
-    <w:basedOn w:val="Normal"/>
-    <w:qFormat/>
-    <w:pPr>
-      <w:spacing w:before="0" w:after="72" w:line="342" w:lineRule="exact"/>
-      <w:ind w:left="1296" w:firstLine="0"/>
-      <w:jc w:val="left"/>
-    </w:pPr>
-    <w:rPr/>
-  </w:style>
-  <w:style w:type="paragraph" w:customStyle="1" w:styleId="CaptionDesignation">
-    <w:name w:val="Caption Designation"/>
-    <w:basedOn w:val="Normal"/>
-    <w:qFormat/>
-    <w:pPr>
-      <w:spacing w:before="0" w:after="72" w:line="342" w:lineRule="exact"/>
-      <w:ind w:left="2304" w:firstLine="0"/>
-      <w:jc w:val="left"/>
-    </w:pPr>
-    <w:rPr/>
-  </w:style>
-  <w:style w:type="paragraph" w:customStyle="1" w:styleId="CaptionTitle">
-    <w:name w:val="Caption Title"/>
-    <w:basedOn w:val="Normal"/>
-    <w:qFormat/>
-    <w:pPr>
-      <w:spacing w:before="0" w:after="72" w:line="342" w:lineRule="exact"/>
-      <w:ind w:firstLine="0"/>
-      <w:jc w:val="left"/>
-    </w:pPr>
-    <w:rPr>
-      <w:b/>
-      <w:bCs/>
-    </w:rPr>
-  </w:style>
-  <w:style w:type="paragraph" w:customStyle="1" w:styleId="CourtLine">
-    <w:name w:val="Court Line"/>
-    <w:basedOn w:val="Normal"/>
-    <w:qFormat/>
-    <w:pPr>
-      <w:spacing w:before="0" w:after="384" w:line="342" w:lineRule="exact"/>
-      <w:keepNext/>
-      <w:ind w:firstLine="0"/>
-      <w:jc w:val="center"/>
-    </w:pPr>
-    <w:rPr>
-      <w:b/>
-      <w:bCs/>
-    </w:rPr>
-  </w:style>
-  <w:style w:type="paragraph" w:customStyle="1" w:styleId="Spacer">
-    <w:name w:val="Spacer"/>
-    <w:basedOn w:val="Normal"/>
-    <w:qFormat/>
-    <w:pPr>
-      <w:spacing w:before="0" w:after="0" w:line="384" w:lineRule="exact"/>
-      <w:ind w:firstLine="0"/>
-    </w:pPr>
-    <w:rPr>
-      <w:sz w:val="2"/>
-    </w:rPr>
-  </w:style>
-  <w:style w:type="paragraph" w:customStyle="1" w:styleId="Honorable">
-    <w:name w:val="Honorable"/>
-    <w:basedOn w:val="Normal"/>
-    <w:qFormat/>
-    <w:pPr>
-      <w:spacing w:before="384" w:after="240" w:line="342" w:lineRule="exact"/>
-      <w:keepNext/>
-      <w:ind w:firstLine="0"/>
-      <w:jc w:val="center"/>
-    </w:pPr>
-    <w:rPr>
-      <w:b/>
-      <w:bCs/>
-    </w:rPr>
-  </w:style>
-  <w:style w:type="paragraph" w:customStyle="1" w:styleId="HonorableTop">
-    <w:name w:val="Honorable Top"/>
-    <w:basedOn w:val="Normal"/>
-    <w:qFormat/>
-    <w:pPr>
-      <w:spacing w:before="0" w:after="240" w:line="342" w:lineRule="exact"/>
-      <w:keepNext/>
-      <w:ind w:firstLine="0"/>
-      <w:jc w:val="center"/>
-    </w:pPr>
-    <w:rPr>
-      <w:b/>
-      <w:bCs/>
-    </w:rPr>
-  </w:style>
-  <w:style w:type="paragraph" w:customStyle="1" w:styleId="CounselBlock">
-    <w:name w:val="Counsel Block"/>
-    <w:basedOn w:val="Normal"/>
-    <w:qFormat/>
-    <w:pPr>
-      <w:spacing w:before="0" w:after="340" w:line="342" w:lineRule="exact"/>
-      <w:ind w:left="936" w:right="936" w:firstLine="0"/>
-      <w:jc w:val="center"/>
-    </w:pPr>
-    <w:rPr/>
-  </w:style>
-  <w:style w:type="paragraph" w:customStyle="1" w:styleId="TocPageLabel">
-    <w:name w:val="Toc Page Label"/>
-    <w:basedOn w:val="Normal"/>
-    <w:qFormat/>
-    <w:pPr>
-      <w:spacing w:before="72" w:after="0" w:line="342" w:lineRule="exact"/>
-      <w:ind w:firstLine="0"/>
-      <w:jc w:val="right"/>
-    </w:pPr>
-    <w:rPr>
-      <w:b/>
-      <w:bCs/>
-      <w:u w:val="single"/>
-    </w:rPr>
-  </w:style>
-  <w:style w:type="paragraph" w:customStyle="1" w:styleId="TocEntry1">
-    <w:name w:val="Toc Entry 1"/>
-    <w:basedOn w:val="Normal"/>
-    <w:qFormat/>
-    <w:pPr>
-      <w:keepLines/>
-      <w:spacing w:before="144" w:after="0" w:line="342" w:lineRule="exact"/>
-      <w:tabs>
-        <w:tab w:val="right" w:leader="dot" w:pos="9360"/>
-      </w:tabs>
-      <w:ind w:left="720" w:right="864" w:hanging="720"/>
-      <w:jc w:val="left"/>
-    </w:pPr>
-    <w:rPr/>
-  </w:style>
-  <w:style w:type="paragraph" w:customStyle="1" w:styleId="TocEntry2">
-    <w:name w:val="Toc Entry 2"/>
-    <w:basedOn w:val="Normal"/>
-    <w:qFormat/>
-    <w:pPr>
-      <w:keepLines/>
-      <w:spacing w:before="84" w:after="0" w:line="342" w:lineRule="exact"/>
-      <w:tabs>
-        <w:tab w:val="right" w:leader="dot" w:pos="9360"/>
-      </w:tabs>
-      <w:ind w:left="720" w:right="864" w:hanging="720"/>
-      <w:jc w:val="left"/>
-    </w:pPr>
-    <w:rPr/>
-  </w:style>
-  <w:style w:type="paragraph" w:customStyle="1" w:styleId="TocEntry3">
-    <w:name w:val="Toc Entry 3"/>
-    <w:basedOn w:val="Normal"/>
-    <w:qFormat/>
-    <w:pPr>
-      <w:keepLines/>
-      <w:spacing w:before="84" w:after="0" w:line="342" w:lineRule="exact"/>
-      <w:tabs>
-        <w:tab w:val="right" w:leader="dot" w:pos="9360"/>
-      </w:tabs>
-      <w:ind w:left="1440" w:right="864" w:hanging="720"/>
-      <w:jc w:val="left"/>
-    </w:pPr>
-    <w:rPr/>
-  </w:style>
-  <w:style w:type="paragraph" w:customStyle="1" w:styleId="TocEntry4">
-    <w:name w:val="Toc Entry 4"/>
-    <w:basedOn w:val="Normal"/>
-    <w:qFormat/>
-    <w:pPr>
-      <w:keepLines/>
-      <w:spacing w:before="84" w:after="0" w:line="342" w:lineRule="exact"/>
-      <w:tabs>
-        <w:tab w:val="right" w:leader="dot" w:pos="9360"/>
-      </w:tabs>
-      <w:ind w:left="2160" w:right="864" w:hanging="720"/>
-      <w:jc w:val="left"/>
-    </w:pPr>
-    <w:rPr/>
-  </w:style>
-  <w:style w:type="paragraph" w:customStyle="1" w:styleId="ToaGroup">
-    <w:name w:val="Toa Group"/>
-    <w:basedOn w:val="Normal"/>
-    <w:qFormat/>
-    <w:pPr>
-      <w:keepNext/>
-      <w:spacing w:before="240" w:after="60" w:line="342" w:lineRule="exact"/>
-      <w:tabs>
-        <w:tab w:val="right" w:pos="9360"/>
-      </w:tabs>
-      <w:ind w:firstLine="0"/>
-      <w:jc w:val="left"/>
-    </w:pPr>
-    <w:rPr>
-      <w:b/>
-      <w:bCs/>
-    </w:rPr>
-  </w:style>
-  <w:style w:type="paragraph" w:customStyle="1" w:styleId="ToaEntry">
-    <w:name w:val="Toa Entry"/>
-    <w:basedOn w:val="Normal"/>
-    <w:qFormat/>
-    <w:pPr>
-      <w:keepLines/>
-      <w:spacing w:before="168" w:after="0" w:line="342" w:lineRule="exact"/>
-      <w:tabs>
-        <w:tab w:val="right" w:leader="dot" w:pos="9360"/>
-      </w:tabs>
-      <w:ind w:left="504" w:hanging="504"/>
-      <w:jc w:val="left"/>
-    </w:pPr>
-    <w:rPr/>
-  </w:style>
-  <w:style w:type="paragraph" w:customStyle="1" w:styleId="SignatureClosing">
-    <w:name w:val="Signature Closing"/>
-    <w:basedOn w:val="Normal"/>
-    <w:qFormat/>
-    <w:pPr>
-      <w:keepNext/>
-      <w:keepLines/>
-      <w:spacing w:before="240" w:after="528" w:line="342" w:lineRule="exact"/>
-      <w:ind w:left="4320" w:firstLine="0"/>
-      <w:jc w:val="left"/>
-    </w:pPr>
-    <w:rPr/>
-  </w:style>
-  <w:style w:type="paragraph" w:customStyle="1" w:styleId="SignatureBlock">
-    <w:name w:val="Signature Block"/>
-    <w:basedOn w:val="Normal"/>
-    <w:qFormat/>
-    <w:pPr>
-      <w:keepLines/>
-      <w:spacing w:before="0" w:after="0" w:line="342" w:lineRule="exact"/>
-      <w:ind w:left="4320" w:firstLine="0"/>
-      <w:jc w:val="left"/>
-    </w:pPr>
-    <w:rPr/>
-  </w:style>
-  <w:style w:type="paragraph" w:customStyle="1" w:styleId="SignatureBlockAlone">
-    <w:name w:val="Signature Block Alone"/>
-    <w:basedOn w:val="Normal"/>
-    <w:qFormat/>
-    <w:pPr>
-      <w:keepLines/>
-      <w:spacing w:before="240" w:after="0" w:line="342" w:lineRule="exact"/>
-      <w:ind w:left="4320" w:firstLine="0"/>
-      <w:jc w:val="left"/>
-    </w:pPr>
-    <w:rPr/>
-  </w:style>
-  <w:style w:type="paragraph" w:customStyle="1" w:styleId="CertificateBody">
-    <w:name w:val="Certificate Body"/>
-    <w:basedOn w:val="Normal"/>
-    <w:qFormat/>
-    <w:pPr>
-      <w:spacing w:before="0" w:after="0" w:line="540" w:lineRule="exact"/>
-      <w:ind w:firstLine="720"/>
-      <w:jc w:val="left"/>
-    </w:pPr>
-    <w:rPr/>
   </w:style>
 </w:styles>
 </file>

</xml_diff>